<commit_message>
Added Advanced C2 theory notes
</commit_message>
<xml_diff>
--- a/Week 4/Final Report Week 4.docx
+++ b/Week 4/Final Report Week 4.docx
@@ -73,15 +73,7 @@
           <w:sz w:val="21"/>
           <w:szCs w:val="21"/>
         </w:rPr>
-        <w:t>mkdir -p ~/cyart-red-teaming/Week\</w:t>
-      </w:r>
-      <w:r>
-        <w:rPr>
-          <w:rStyle w:val="SourceText"/>
-          <w:sz w:val="21"/>
-          <w:szCs w:val="21"/>
-        </w:rPr>
-        <w:t>4</w:t>
+        <w:t>mkdir -p ~/cyart-red-teaming/Week\4</w:t>
       </w:r>
     </w:p>
     <w:p>
@@ -486,8 +478,8 @@
         </w:tblCellMar>
       </w:tblPr>
       <w:tblGrid>
-        <w:gridCol w:w="3570"/>
-        <w:gridCol w:w="4305"/>
+        <w:gridCol w:w="3569"/>
+        <w:gridCol w:w="4306"/>
       </w:tblGrid>
       <w:tr>
         <w:trPr>
@@ -495,7 +487,7 @@
         </w:trPr>
         <w:tc>
           <w:tcPr>
-            <w:tcW w:w="3570" w:type="dxa"/>
+            <w:tcW w:w="3569" w:type="dxa"/>
             <w:tcBorders/>
             <w:vAlign w:val="center"/>
           </w:tcPr>
@@ -512,7 +504,7 @@
         </w:tc>
         <w:tc>
           <w:tcPr>
-            <w:tcW w:w="4305" w:type="dxa"/>
+            <w:tcW w:w="4306" w:type="dxa"/>
             <w:tcBorders/>
             <w:vAlign w:val="center"/>
           </w:tcPr>
@@ -532,7 +524,7 @@
         <w:trPr/>
         <w:tc>
           <w:tcPr>
-            <w:tcW w:w="3570" w:type="dxa"/>
+            <w:tcW w:w="3569" w:type="dxa"/>
             <w:tcBorders/>
             <w:vAlign w:val="center"/>
           </w:tcPr>
@@ -549,7 +541,7 @@
         </w:tc>
         <w:tc>
           <w:tcPr>
-            <w:tcW w:w="4305" w:type="dxa"/>
+            <w:tcW w:w="4306" w:type="dxa"/>
             <w:tcBorders/>
             <w:vAlign w:val="center"/>
           </w:tcPr>
@@ -569,7 +561,7 @@
         <w:trPr/>
         <w:tc>
           <w:tcPr>
-            <w:tcW w:w="3570" w:type="dxa"/>
+            <w:tcW w:w="3569" w:type="dxa"/>
             <w:tcBorders/>
             <w:vAlign w:val="center"/>
           </w:tcPr>
@@ -586,7 +578,7 @@
         </w:tc>
         <w:tc>
           <w:tcPr>
-            <w:tcW w:w="4305" w:type="dxa"/>
+            <w:tcW w:w="4306" w:type="dxa"/>
             <w:tcBorders/>
             <w:vAlign w:val="center"/>
           </w:tcPr>
@@ -700,7 +692,7 @@
       <w:r>
         <w:rPr/>
         <w:drawing>
-          <wp:anchor distT="0" distB="0" distL="0" distR="0" simplePos="0" relativeHeight="14" behindDoc="0" locked="0" layoutInCell="0" allowOverlap="1">
+          <wp:anchor distT="0" distB="0" distL="0" distR="0" simplePos="0" relativeHeight="17" behindDoc="0" locked="0" layoutInCell="0" allowOverlap="1">
             <wp:simplePos x="0" y="0"/>
             <wp:positionH relativeFrom="column">
               <wp:posOffset>-57150</wp:posOffset>
@@ -809,7 +801,7 @@
       <w:r>
         <w:rPr/>
         <w:drawing>
-          <wp:anchor distT="0" distB="0" distL="0" distR="0" simplePos="0" relativeHeight="15" behindDoc="0" locked="0" layoutInCell="0" allowOverlap="1">
+          <wp:anchor distT="0" distB="0" distL="0" distR="0" simplePos="0" relativeHeight="18" behindDoc="0" locked="0" layoutInCell="0" allowOverlap="1">
             <wp:simplePos x="0" y="0"/>
             <wp:positionH relativeFrom="column">
               <wp:posOffset>-9525</wp:posOffset>
@@ -923,7 +915,7 @@
       <w:r>
         <w:rPr/>
         <w:drawing>
-          <wp:anchor distT="0" distB="0" distL="0" distR="0" simplePos="0" relativeHeight="16" behindDoc="0" locked="0" layoutInCell="0" allowOverlap="1">
+          <wp:anchor distT="0" distB="0" distL="0" distR="0" simplePos="0" relativeHeight="19" behindDoc="0" locked="0" layoutInCell="0" allowOverlap="1">
             <wp:simplePos x="0" y="0"/>
             <wp:positionH relativeFrom="column">
               <wp:posOffset>-152400</wp:posOffset>
@@ -985,6 +977,7 @@
     <w:p>
       <w:pPr>
         <w:pStyle w:val="Normal"/>
+        <w:spacing w:before="0" w:after="0"/>
         <w:rPr/>
       </w:pPr>
       <w:r>
@@ -1043,7 +1036,7 @@
       <w:r>
         <w:rPr/>
         <w:drawing>
-          <wp:anchor distT="0" distB="0" distL="0" distR="0" simplePos="0" relativeHeight="17" behindDoc="0" locked="0" layoutInCell="0" allowOverlap="1">
+          <wp:anchor distT="0" distB="0" distL="0" distR="0" simplePos="0" relativeHeight="20" behindDoc="0" locked="0" layoutInCell="0" allowOverlap="1">
             <wp:simplePos x="0" y="0"/>
             <wp:positionH relativeFrom="column">
               <wp:align>center</wp:align>
@@ -1221,6 +1214,7 @@
     <w:p>
       <w:pPr>
         <w:pStyle w:val="Normal"/>
+        <w:spacing w:before="0" w:after="0"/>
         <w:rPr/>
       </w:pPr>
       <w:r>
@@ -1320,7 +1314,7 @@
       <w:r>
         <w:rPr/>
         <w:drawing>
-          <wp:anchor distT="0" distB="0" distL="0" distR="0" simplePos="0" relativeHeight="18" behindDoc="0" locked="0" layoutInCell="0" allowOverlap="1">
+          <wp:anchor distT="0" distB="0" distL="0" distR="0" simplePos="0" relativeHeight="21" behindDoc="0" locked="0" layoutInCell="0" allowOverlap="1">
             <wp:simplePos x="0" y="0"/>
             <wp:positionH relativeFrom="column">
               <wp:posOffset>-1270</wp:posOffset>
@@ -1457,7 +1451,7 @@
       <w:r>
         <w:rPr/>
         <w:drawing>
-          <wp:anchor distT="0" distB="0" distL="0" distR="0" simplePos="0" relativeHeight="19" behindDoc="0" locked="0" layoutInCell="0" allowOverlap="1">
+          <wp:anchor distT="0" distB="0" distL="0" distR="0" simplePos="0" relativeHeight="22" behindDoc="0" locked="0" layoutInCell="0" allowOverlap="1">
             <wp:simplePos x="0" y="0"/>
             <wp:positionH relativeFrom="column">
               <wp:align>center</wp:align>
@@ -1521,14 +1515,283 @@
       <w:r>
         <w:rPr/>
       </w:r>
+      <w:r>
+        <w:br w:type="page"/>
+      </w:r>
+    </w:p>
+    <w:p>
+      <w:pPr>
+        <w:pStyle w:val="Normal"/>
+        <w:rPr/>
+      </w:pPr>
+      <w:r>
+        <w:rPr/>
+        <w:t>Vartule machine : Windows lab</w:t>
+      </w:r>
+    </w:p>
+    <w:p>
+      <w:pPr>
+        <w:pStyle w:val="Normal"/>
+        <w:rPr/>
+      </w:pPr>
+      <w:r>
+        <w:rPr/>
+        <w:t>ipconfig</w:t>
+      </w:r>
+    </w:p>
+    <w:p>
+      <w:pPr>
+        <w:pStyle w:val="Normal"/>
+        <w:rPr/>
+      </w:pPr>
+      <w:r>
+        <w:rPr/>
+      </w:r>
+    </w:p>
+    <w:p>
+      <w:pPr>
+        <w:pStyle w:val="Normal"/>
+        <w:rPr/>
+      </w:pPr>
+      <w:r>
+        <w:rPr/>
+        <w:drawing>
+          <wp:anchor distT="0" distB="0" distL="0" distR="0" simplePos="0" relativeHeight="23" behindDoc="0" locked="0" layoutInCell="0" allowOverlap="1">
+            <wp:simplePos x="0" y="0"/>
+            <wp:positionH relativeFrom="column">
+              <wp:posOffset>-171450</wp:posOffset>
+            </wp:positionH>
+            <wp:positionV relativeFrom="paragraph">
+              <wp:posOffset>88900</wp:posOffset>
+            </wp:positionV>
+            <wp:extent cx="5731510" cy="4722495"/>
+            <wp:effectExtent l="0" t="0" r="0" b="0"/>
+            <wp:wrapSquare wrapText="largest"/>
+            <wp:docPr id="7" name="Image7"/>
+            <wp:cNvGraphicFramePr>
+              <a:graphicFrameLocks xmlns:a="http://schemas.openxmlformats.org/drawingml/2006/main" noChangeAspect="1"/>
+            </wp:cNvGraphicFramePr>
+            <a:graphic xmlns:a="http://schemas.openxmlformats.org/drawingml/2006/main">
+              <a:graphicData uri="http://schemas.openxmlformats.org/drawingml/2006/picture">
+                <pic:pic xmlns:pic="http://schemas.openxmlformats.org/drawingml/2006/picture">
+                  <pic:nvPicPr>
+                    <pic:cNvPr id="7" name="Image7"/>
+                    <pic:cNvPicPr>
+                      <a:picLocks noChangeAspect="1" noChangeArrowheads="1"/>
+                    </pic:cNvPicPr>
+                  </pic:nvPicPr>
+                  <pic:blipFill>
+                    <a:blip r:embed="rId8"/>
+                    <a:stretch>
+                      <a:fillRect/>
+                    </a:stretch>
+                  </pic:blipFill>
+                  <pic:spPr bwMode="auto">
+                    <a:xfrm>
+                      <a:off x="0" y="0"/>
+                      <a:ext cx="5731510" cy="4722495"/>
+                    </a:xfrm>
+                    <a:prstGeom prst="rect">
+                      <a:avLst/>
+                    </a:prstGeom>
+                    <a:noFill/>
+                  </pic:spPr>
+                </pic:pic>
+              </a:graphicData>
+            </a:graphic>
+          </wp:anchor>
+        </w:drawing>
+      </w:r>
+    </w:p>
+    <w:p>
+      <w:pPr>
+        <w:pStyle w:val="Normal"/>
+        <w:rPr/>
+      </w:pPr>
+      <w:r>
+        <w:rPr/>
+        <w:t xml:space="preserve">kali </w:t>
+      </w:r>
+    </w:p>
+    <w:p>
+      <w:pPr>
+        <w:pStyle w:val="Normal"/>
+        <w:rPr/>
+      </w:pPr>
+      <w:r>
+        <w:rPr/>
+      </w:r>
+    </w:p>
+    <w:p>
+      <w:pPr>
+        <w:pStyle w:val="Normal"/>
+        <w:rPr/>
+      </w:pPr>
+      <w:r>
+        <w:rPr/>
+        <w:drawing>
+          <wp:anchor distT="0" distB="0" distL="0" distR="0" simplePos="0" relativeHeight="24" behindDoc="0" locked="0" layoutInCell="0" allowOverlap="1">
+            <wp:simplePos x="0" y="0"/>
+            <wp:positionH relativeFrom="column">
+              <wp:align>center</wp:align>
+            </wp:positionH>
+            <wp:positionV relativeFrom="paragraph">
+              <wp:posOffset>635</wp:posOffset>
+            </wp:positionV>
+            <wp:extent cx="5343525" cy="2638425"/>
+            <wp:effectExtent l="0" t="0" r="0" b="0"/>
+            <wp:wrapSquare wrapText="largest"/>
+            <wp:docPr id="8" name="Image9"/>
+            <wp:cNvGraphicFramePr>
+              <a:graphicFrameLocks xmlns:a="http://schemas.openxmlformats.org/drawingml/2006/main" noChangeAspect="1"/>
+            </wp:cNvGraphicFramePr>
+            <a:graphic xmlns:a="http://schemas.openxmlformats.org/drawingml/2006/main">
+              <a:graphicData uri="http://schemas.openxmlformats.org/drawingml/2006/picture">
+                <pic:pic xmlns:pic="http://schemas.openxmlformats.org/drawingml/2006/picture">
+                  <pic:nvPicPr>
+                    <pic:cNvPr id="8" name="Image9"/>
+                    <pic:cNvPicPr>
+                      <a:picLocks noChangeAspect="1" noChangeArrowheads="1"/>
+                    </pic:cNvPicPr>
+                  </pic:nvPicPr>
+                  <pic:blipFill>
+                    <a:blip r:embed="rId9"/>
+                    <a:stretch>
+                      <a:fillRect/>
+                    </a:stretch>
+                  </pic:blipFill>
+                  <pic:spPr bwMode="auto">
+                    <a:xfrm>
+                      <a:off x="0" y="0"/>
+                      <a:ext cx="5343525" cy="2638425"/>
+                    </a:xfrm>
+                    <a:prstGeom prst="rect">
+                      <a:avLst/>
+                    </a:prstGeom>
+                    <a:noFill/>
+                  </pic:spPr>
+                </pic:pic>
+              </a:graphicData>
+            </a:graphic>
+          </wp:anchor>
+        </w:drawing>
+      </w:r>
+    </w:p>
+    <w:p>
+      <w:pPr>
+        <w:pStyle w:val="Normal"/>
+        <w:rPr/>
+      </w:pPr>
+      <w:r>
+        <w:rPr/>
+      </w:r>
+    </w:p>
+    <w:p>
+      <w:pPr>
+        <w:pStyle w:val="Normal"/>
+        <w:rPr/>
+      </w:pPr>
+      <w:r>
+        <w:rPr/>
+      </w:r>
+    </w:p>
+    <w:p>
+      <w:pPr>
+        <w:pStyle w:val="Normal"/>
+        <w:rPr/>
+      </w:pPr>
+      <w:r>
+        <w:rPr/>
+      </w:r>
+    </w:p>
+    <w:p>
+      <w:pPr>
+        <w:pStyle w:val="Normal"/>
+        <w:rPr/>
+      </w:pPr>
+      <w:r>
+        <w:rPr/>
+      </w:r>
+    </w:p>
+    <w:p>
+      <w:pPr>
+        <w:pStyle w:val="Normal"/>
+        <w:rPr/>
+      </w:pPr>
+      <w:r>
+        <w:rPr/>
+      </w:r>
+    </w:p>
+    <w:p>
+      <w:pPr>
+        <w:pStyle w:val="Normal"/>
+        <w:rPr/>
+      </w:pPr>
+      <w:r>
+        <w:rPr/>
+      </w:r>
+    </w:p>
+    <w:p>
+      <w:pPr>
+        <w:pStyle w:val="Normal"/>
+        <w:rPr/>
+      </w:pPr>
+      <w:r>
+        <w:rPr/>
+      </w:r>
+    </w:p>
+    <w:p>
+      <w:pPr>
+        <w:pStyle w:val="Normal"/>
+        <w:rPr/>
+      </w:pPr>
+      <w:r>
+        <w:rPr/>
+      </w:r>
+    </w:p>
+    <w:p>
+      <w:pPr>
+        <w:pStyle w:val="Normal"/>
+        <w:rPr/>
+      </w:pPr>
+      <w:r>
+        <w:rPr/>
+      </w:r>
+    </w:p>
+    <w:p>
+      <w:pPr>
+        <w:pStyle w:val="Normal"/>
+        <w:rPr/>
+      </w:pPr>
+      <w:r>
+        <w:rPr/>
+      </w:r>
+    </w:p>
+    <w:p>
+      <w:pPr>
+        <w:pStyle w:val="Normal"/>
+        <w:rPr/>
+      </w:pPr>
+      <w:r>
+        <w:rPr/>
+      </w:r>
+    </w:p>
+    <w:p>
+      <w:pPr>
+        <w:pStyle w:val="Normal"/>
+        <w:rPr/>
+      </w:pPr>
+      <w:r>
+        <w:rPr/>
+      </w:r>
     </w:p>
     <w:sectPr>
-      <w:headerReference w:type="even" r:id="rId8"/>
-      <w:headerReference w:type="default" r:id="rId9"/>
-      <w:headerReference w:type="first" r:id="rId10"/>
-      <w:footerReference w:type="even" r:id="rId11"/>
-      <w:footerReference w:type="default" r:id="rId12"/>
-      <w:footerReference w:type="first" r:id="rId13"/>
+      <w:headerReference w:type="even" r:id="rId10"/>
+      <w:headerReference w:type="default" r:id="rId11"/>
+      <w:headerReference w:type="first" r:id="rId12"/>
+      <w:footerReference w:type="even" r:id="rId13"/>
+      <w:footerReference w:type="default" r:id="rId14"/>
+      <w:footerReference w:type="first" r:id="rId15"/>
       <w:type w:val="nextPage"/>
       <w:pgSz w:w="11906" w:h="16838"/>
       <w:pgMar w:left="1440" w:right="1440" w:gutter="0" w:header="576" w:top="1440" w:footer="432" w:bottom="1440"/>
@@ -1571,15 +1834,11 @@
             <wp:inline distT="0" distB="0" distL="0" distR="0">
               <wp:extent cx="5731510" cy="19050"/>
               <wp:effectExtent l="0" t="0" r="0" b="0"/>
-              <wp:docPr id="9" name=""/>
+              <wp:docPr id="11" name="Shape1"/>
               <a:graphic xmlns:a="http://schemas.openxmlformats.org/drawingml/2006/main">
                 <a:graphicData uri="http://schemas.microsoft.com/office/word/2010/wordprocessingShape">
                   <wps:wsp>
                     <wps:cNvSpPr/>
-                    <wps:nvSpPr>
-                      <wps:cNvPr id="10" name=""/>
-                      <wps:cNvSpPr/>
-                    </wps:nvSpPr>
                     <wps:spPr>
                       <a:xfrm>
                         <a:off x="0" y="0"/>
@@ -1595,6 +1854,12 @@
                         <a:noFill/>
                       </a:ln>
                     </wps:spPr>
+                    <wps:style>
+                      <a:lnRef idx="0"/>
+                      <a:fillRef idx="0"/>
+                      <a:effectRef idx="0"/>
+                      <a:fontRef idx="minor"/>
+                    </wps:style>
                     <wps:bodyPr/>
                   </wps:wsp>
                 </a:graphicData>
@@ -1607,10 +1872,10 @@
         </mc:Choice>
         <mc:Fallback>
           <w:pict>
-            <v:rect id="shape_0" fillcolor="#a0a0a0" stroked="f" o:allowincell="f" style="position:absolute;margin-left:0pt;margin-top:-1.55pt;width:451.25pt;height:1.45pt;mso-wrap-style:none;v-text-anchor:middle;mso-position-horizontal:center;mso-position-vertical:top">
+            <v:rect id="shape_0" fillcolor="#a0a0a0" stroked="f" o:allowincell="f" style="position:absolute;margin-left:0pt;margin-top:-1.55pt;width:451.25pt;height:1.45pt;mso-wrap-style:none;v-text-anchor:middle;mso-position-vertical:top">
               <v:fill o:detectmouseclick="t" type="solid" color2="#5f5f5f"/>
               <v:stroke color="#3465a4" joinstyle="round" endcap="flat"/>
-              <w10:wrap type="topAndBottom"/>
+              <w10:wrap type="square"/>
             </v:rect>
           </w:pict>
         </mc:Fallback>
@@ -1637,7 +1902,7 @@
     </w:r>
     <w:r>
       <w:rPr/>
-      <w:t>4</w:t>
+      <w:t>7</w:t>
     </w:r>
     <w:r>
       <w:rPr/>
@@ -1663,15 +1928,11 @@
             <wp:inline distT="0" distB="0" distL="0" distR="0">
               <wp:extent cx="5731510" cy="19050"/>
               <wp:effectExtent l="0" t="0" r="0" b="0"/>
-              <wp:docPr id="11" name=""/>
+              <wp:docPr id="12" name="Shape1"/>
               <a:graphic xmlns:a="http://schemas.openxmlformats.org/drawingml/2006/main">
                 <a:graphicData uri="http://schemas.microsoft.com/office/word/2010/wordprocessingShape">
                   <wps:wsp>
                     <wps:cNvSpPr/>
-                    <wps:nvSpPr>
-                      <wps:cNvPr id="12" name=""/>
-                      <wps:cNvSpPr/>
-                    </wps:nvSpPr>
                     <wps:spPr>
                       <a:xfrm>
                         <a:off x="0" y="0"/>
@@ -1687,6 +1948,12 @@
                         <a:noFill/>
                       </a:ln>
                     </wps:spPr>
+                    <wps:style>
+                      <a:lnRef idx="0"/>
+                      <a:fillRef idx="0"/>
+                      <a:effectRef idx="0"/>
+                      <a:fontRef idx="minor"/>
+                    </wps:style>
                     <wps:bodyPr/>
                   </wps:wsp>
                 </a:graphicData>
@@ -1699,10 +1966,10 @@
         </mc:Choice>
         <mc:Fallback>
           <w:pict>
-            <v:rect id="shape_0" fillcolor="#a0a0a0" stroked="f" o:allowincell="f" style="position:absolute;margin-left:0pt;margin-top:-1.55pt;width:451.25pt;height:1.45pt;mso-wrap-style:none;v-text-anchor:middle;mso-position-horizontal:center;mso-position-vertical:top">
+            <v:rect id="shape_0" fillcolor="#a0a0a0" stroked="f" o:allowincell="f" style="position:absolute;margin-left:0pt;margin-top:-1.55pt;width:451.25pt;height:1.45pt;mso-wrap-style:none;v-text-anchor:middle;mso-position-vertical:top">
               <v:fill o:detectmouseclick="t" type="solid" color2="#5f5f5f"/>
               <v:stroke color="#3465a4" joinstyle="round" endcap="flat"/>
-              <w10:wrap type="topAndBottom"/>
+              <w10:wrap type="square"/>
             </v:rect>
           </w:pict>
         </mc:Fallback>
@@ -1729,7 +1996,7 @@
     </w:r>
     <w:r>
       <w:rPr/>
-      <w:t>4</w:t>
+      <w:t>7</w:t>
     </w:r>
     <w:r>
       <w:rPr/>
@@ -1763,7 +2030,7 @@
     <w:r>
       <w:rPr/>
       <w:drawing>
-        <wp:anchor distT="114300" distB="114300" distL="114300" distR="114300" simplePos="0" relativeHeight="7" behindDoc="1" locked="0" layoutInCell="0" allowOverlap="1">
+        <wp:anchor distT="114300" distB="114300" distL="114300" distR="114300" simplePos="0" relativeHeight="8" behindDoc="1" locked="0" layoutInCell="0" allowOverlap="1">
           <wp:simplePos x="0" y="0"/>
           <wp:positionH relativeFrom="column">
             <wp:posOffset>-1444625</wp:posOffset>
@@ -1774,7 +2041,7 @@
           <wp:extent cx="8618220" cy="1023620"/>
           <wp:effectExtent l="0" t="0" r="0" b="0"/>
           <wp:wrapTopAndBottom/>
-          <wp:docPr id="7" name="image1.png"/>
+          <wp:docPr id="9" name="image1.png"/>
           <wp:cNvGraphicFramePr>
             <a:graphicFrameLocks xmlns:a="http://schemas.openxmlformats.org/drawingml/2006/main" noChangeAspect="1"/>
           </wp:cNvGraphicFramePr>
@@ -1782,7 +2049,7 @@
             <a:graphicData uri="http://schemas.openxmlformats.org/drawingml/2006/picture">
               <pic:pic xmlns:pic="http://schemas.openxmlformats.org/drawingml/2006/picture">
                 <pic:nvPicPr>
-                  <pic:cNvPr id="7" name="image1.png"/>
+                  <pic:cNvPr id="9" name="image1.png"/>
                   <pic:cNvPicPr>
                     <a:picLocks noChangeAspect="1" noChangeArrowheads="1"/>
                   </pic:cNvPicPr>
@@ -1824,7 +2091,7 @@
     <w:r>
       <w:rPr/>
       <w:drawing>
-        <wp:anchor distT="114300" distB="114300" distL="114300" distR="114300" simplePos="0" relativeHeight="7" behindDoc="1" locked="0" layoutInCell="0" allowOverlap="1">
+        <wp:anchor distT="114300" distB="114300" distL="114300" distR="114300" simplePos="0" relativeHeight="8" behindDoc="1" locked="0" layoutInCell="0" allowOverlap="1">
           <wp:simplePos x="0" y="0"/>
           <wp:positionH relativeFrom="column">
             <wp:posOffset>-1444625</wp:posOffset>
@@ -1835,7 +2102,7 @@
           <wp:extent cx="8618220" cy="1023620"/>
           <wp:effectExtent l="0" t="0" r="0" b="0"/>
           <wp:wrapTopAndBottom/>
-          <wp:docPr id="8" name="image1.png"/>
+          <wp:docPr id="10" name="image1.png"/>
           <wp:cNvGraphicFramePr>
             <a:graphicFrameLocks xmlns:a="http://schemas.openxmlformats.org/drawingml/2006/main" noChangeAspect="1"/>
           </wp:cNvGraphicFramePr>
@@ -1843,7 +2110,7 @@
             <a:graphicData uri="http://schemas.openxmlformats.org/drawingml/2006/picture">
               <pic:pic xmlns:pic="http://schemas.openxmlformats.org/drawingml/2006/picture">
                 <pic:nvPicPr>
-                  <pic:cNvPr id="8" name="image1.png"/>
+                  <pic:cNvPr id="10" name="image1.png"/>
                   <pic:cNvPicPr>
                     <a:picLocks noChangeAspect="1" noChangeArrowheads="1"/>
                   </pic:cNvPicPr>
@@ -2275,6 +2542,7 @@
     <w:qFormat/>
     <w:pPr>
       <w:widowControl/>
+      <w:suppressAutoHyphens w:val="true"/>
       <w:bidi w:val="0"/>
       <w:spacing w:lineRule="auto" w:line="276" w:before="0" w:after="0"/>
       <w:jc w:val="start"/>

</xml_diff>